<commit_message>
refactor: Eliminar Stripe Connect y usar pasarela directa
</commit_message>
<xml_diff>
--- a/MANUAL ESTRUCUTURA PARA CLONACION.docx
+++ b/MANUAL ESTRUCUTURA PARA CLONACION.docx
@@ -48,7 +48,17 @@
       </w:r>
       <w:r>
         <w:rPr/>
-        <w:t xml:space="preserve">. Estás trabajando en la rama </w:t>
+        <w:t xml:space="preserve"> (con </w:t>
+      </w:r>
+      <w:r>
+        <w:rPr>
+          <w:rStyle w:val="Textooriginal"/>
+        </w:rPr>
+        <w:t>main</w:t>
+      </w:r>
+      <w:r>
+        <w:rPr/>
+        <w:t xml:space="preserve"> como rama por defecto). Estás trabajando en la rama </w:t>
       </w:r>
       <w:r>
         <w:rPr>
@@ -58,7 +68,17 @@
       </w:r>
       <w:r>
         <w:rPr/>
-        <w:t xml:space="preserve"> y Vercel ya está conectado a ella. Todo esto está perfecto y no se toca.</w:t>
+        <w:t xml:space="preserve"> y su Vercel ya está fijado a ella mediante </w:t>
+      </w:r>
+      <w:r>
+        <w:rPr>
+          <w:i/>
+        </w:rPr>
+        <w:t>Branch Tracking</w:t>
+      </w:r>
+      <w:r>
+        <w:rPr/>
+        <w:t>. Todo esto está perfecto y no se toca.</w:t>
       </w:r>
     </w:p>
     <w:p>
@@ -73,22 +93,18 @@
     </w:p>
     <w:p>
       <w:pPr>
-        <w:pStyle w:val="Heading4"/>
-        <w:rPr/>
-      </w:pPr>
-      <w:r>
-        <w:rPr/>
+        <w:pStyle w:val="BodyText"/>
+        <w:rPr/>
+      </w:pPr>
+      <w:r>
+        <w:rPr>
+          <w:b/>
+        </w:rPr>
         <w:t>PASO 1: Crear la rama de Roma en tu única carpeta</w:t>
       </w:r>
-    </w:p>
-    <w:p>
-      <w:pPr>
-        <w:pStyle w:val="BodyText"/>
-        <w:rPr/>
-      </w:pPr>
-      <w:r>
-        <w:rPr/>
-        <w:t>Abres la terminal en tu carpeta de siempre (</w:t>
+      <w:r>
+        <w:rPr/>
+        <w:t xml:space="preserve"> Abres la terminal en tu carpeta de siempre (</w:t>
       </w:r>
       <w:r>
         <w:rPr>
@@ -121,7 +137,7 @@
         <w:rPr>
           <w:rStyle w:val="Textooriginal"/>
         </w:rPr>
-        <w:t># 1. Vuelves a tu código limpio (sin los colores/logos de Moul)</w:t>
+        <w:t># 1. Vuelves a tu código limpio base (main)</w:t>
       </w:r>
     </w:p>
     <w:p>
@@ -219,12 +235,16 @@
     </w:p>
     <w:p>
       <w:pPr>
-        <w:pStyle w:val="Heading4"/>
-        <w:rPr/>
-      </w:pPr>
-      <w:r>
-        <w:rPr/>
-        <w:t>PASO 2: Crear el Vercel de Roma (Desde cero, sin menús ocultos)</w:t>
+        <w:pStyle w:val="BodyText"/>
+        <w:rPr>
+          <w:b/>
+        </w:rPr>
+      </w:pPr>
+      <w:r>
+        <w:rPr>
+          <w:b/>
+        </w:rPr>
+        <w:t>PASO 2: Crear el Vercel de Roma (A prueba de fallos)</w:t>
       </w:r>
     </w:p>
     <w:p>
@@ -262,17 +282,7 @@
       </w:pPr>
       <w:r>
         <w:rPr/>
-        <w:t xml:space="preserve">Entras en Vercel y le das a </w:t>
-      </w:r>
-      <w:r>
-        <w:rPr>
-          <w:b/>
-        </w:rPr>
-        <w:t>"Add New Project"</w:t>
-      </w:r>
-      <w:r>
-        <w:rPr/>
-        <w:t>.</w:t>
+        <w:t>Entras en Vercel y le das a "Add New Project".</w:t>
       </w:r>
     </w:p>
     <w:p>
@@ -373,31 +383,37 @@
         <w:rPr/>
       </w:pPr>
       <w:r>
-        <w:rPr>
-          <w:b/>
-        </w:rPr>
-        <w:t>Rama (Branch):</w:t>
-      </w:r>
-      <w:r>
-        <w:rPr/>
-        <w:t xml:space="preserve"> Verás que justo debajo del nombre del proyecto, Vercel te deja elegir la rama. Haces clic y seleccionas </w:t>
-      </w:r>
-      <w:r>
-        <w:rPr>
-          <w:rStyle w:val="Textooriginal"/>
-          <w:b/>
-        </w:rPr>
-        <w:t>pizzeria-roma</w:t>
-      </w:r>
-      <w:r>
-        <w:rPr/>
-        <w:t xml:space="preserve">. </w:t>
-      </w:r>
-      <w:r>
-        <w:rPr>
-          <w:i/>
-        </w:rPr>
-        <w:t>(Así nos saltamos pelearnos con los ajustes después).</w:t>
+        <w:rPr/>
+        <w:t>Despliegas "Environment Variables" y pegas las claves del nuevo Firebase de Roma y su Stripe.</w:t>
+      </w:r>
+    </w:p>
+    <w:p>
+      <w:pPr>
+        <w:pStyle w:val="BodyText"/>
+        <w:numPr>
+          <w:ilvl w:val="1"/>
+          <w:numId w:val="1"/>
+        </w:numPr>
+        <w:tabs>
+          <w:tab w:val="clear" w:pos="709"/>
+          <w:tab w:val="left" w:pos="0" w:leader="none"/>
+        </w:tabs>
+        <w:ind w:hanging="283" w:start="1418"/>
+        <w:rPr/>
+      </w:pPr>
+      <w:r>
+        <w:rPr/>
+        <w:t xml:space="preserve">Le das a </w:t>
+      </w:r>
+      <w:r>
+        <w:rPr>
+          <w:b/>
+        </w:rPr>
+        <w:t>Deploy</w:t>
+      </w:r>
+      <w:r>
+        <w:rPr/>
+        <w:t>.</w:t>
       </w:r>
     </w:p>
     <w:p>
@@ -415,18 +431,55 @@
         <w:rPr/>
       </w:pPr>
       <w:r>
-        <w:rPr/>
-        <w:t xml:space="preserve">Abres la pestaña </w:t>
-      </w:r>
-      <w:r>
-        <w:rPr>
-          <w:b/>
-        </w:rPr>
-        <w:t>"Environment Variables"</w:t>
-      </w:r>
-      <w:r>
-        <w:rPr/>
-        <w:t xml:space="preserve"> (ahí mismo, antes de publicar) y pegas las claves del nuevo Firebase de Roma y su Stripe.</w:t>
+        <w:rPr>
+          <w:b/>
+        </w:rPr>
+        <w:t>EL PASO DE SEGURIDAD OBLIGATORIO:</w:t>
+      </w:r>
+      <w:r>
+        <w:rPr/>
+        <w:t xml:space="preserve"> En cuanto termine de publicarse, ve a </w:t>
+      </w:r>
+      <w:r>
+        <w:rPr>
+          <w:b/>
+        </w:rPr>
+        <w:t>Settings &gt; Environments &gt; Production</w:t>
+      </w:r>
+      <w:r>
+        <w:rPr/>
+        <w:t xml:space="preserve">. En el apartado </w:t>
+      </w:r>
+      <w:r>
+        <w:rPr>
+          <w:b/>
+        </w:rPr>
+        <w:t>Branch Tracking</w:t>
+      </w:r>
+      <w:r>
+        <w:rPr/>
+        <w:t xml:space="preserve">, borra </w:t>
+      </w:r>
+      <w:r>
+        <w:rPr>
+          <w:rStyle w:val="Textooriginal"/>
+        </w:rPr>
+        <w:t>main</w:t>
+      </w:r>
+      <w:r>
+        <w:rPr/>
+        <w:t xml:space="preserve">, escribe </w:t>
+      </w:r>
+      <w:r>
+        <w:rPr>
+          <w:rStyle w:val="Textooriginal"/>
+          <w:b/>
+        </w:rPr>
+        <w:t>pizzeria-roma</w:t>
+      </w:r>
+      <w:r>
+        <w:rPr/>
+        <w:t xml:space="preserve"> y dale a Save.</w:t>
       </w:r>
     </w:p>
     <w:p>
@@ -445,47 +498,43 @@
       </w:pPr>
       <w:r>
         <w:rPr/>
-        <w:t xml:space="preserve">Haces clic en </w:t>
-      </w:r>
-      <w:r>
-        <w:rPr>
-          <w:b/>
-        </w:rPr>
-        <w:t>Deploy</w:t>
-      </w:r>
-      <w:r>
-        <w:rPr/>
-        <w:t>.</w:t>
-      </w:r>
-    </w:p>
-    <w:p>
-      <w:pPr>
-        <w:pStyle w:val="Heading4"/>
-        <w:rPr/>
-      </w:pPr>
-      <w:r>
-        <w:rPr/>
+        <w:t xml:space="preserve">Ve a la pestaña </w:t>
+      </w:r>
+      <w:r>
+        <w:rPr>
+          <w:b/>
+        </w:rPr>
+        <w:t>Deployments</w:t>
+      </w:r>
+      <w:r>
+        <w:rPr/>
+        <w:t xml:space="preserve">, dale a los tres puntitos del último despliegue y selecciona </w:t>
+      </w:r>
+      <w:r>
+        <w:rPr>
+          <w:b/>
+        </w:rPr>
+        <w:t>"Promote to Production"</w:t>
+      </w:r>
+      <w:r>
+        <w:rPr/>
+        <w:t xml:space="preserve"> (o dale a Redeploy) para que la regla se aplique.</w:t>
+      </w:r>
+    </w:p>
+    <w:p>
+      <w:pPr>
+        <w:pStyle w:val="BodyText"/>
+        <w:rPr/>
+      </w:pPr>
+      <w:r>
+        <w:rPr>
+          <w:b/>
+        </w:rPr>
         <w:t>PASO 3: Cómo es tu día a día en Antigravity</w:t>
       </w:r>
-    </w:p>
-    <w:p>
-      <w:pPr>
-        <w:pStyle w:val="BodyText"/>
-        <w:rPr/>
-      </w:pPr>
-      <w:r>
-        <w:rPr/>
-        <w:t xml:space="preserve">Sigues abriendo Antigravity </w:t>
-      </w:r>
-      <w:r>
-        <w:rPr>
-          <w:b/>
-        </w:rPr>
-        <w:t>exactamente igual que siempre</w:t>
-      </w:r>
-      <w:r>
-        <w:rPr/>
-        <w:t xml:space="preserve">, apuntando a tu única carpeta </w:t>
+      <w:r>
+        <w:rPr/>
+        <w:t xml:space="preserve"> Sigues abriendo Antigravity exactamente igual que siempre, apuntando a tu única carpeta </w:t>
       </w:r>
       <w:r>
         <w:rPr>
@@ -513,18 +562,14 @@
         <w:rPr/>
       </w:pPr>
       <w:r>
-        <w:rPr/>
-        <w:t xml:space="preserve">Si te llama el dueño de </w:t>
-      </w:r>
-      <w:r>
-        <w:rPr>
-          <w:b/>
-        </w:rPr>
-        <w:t>Moul</w:t>
-      </w:r>
-      <w:r>
-        <w:rPr/>
-        <w:t xml:space="preserve"> para un cambio: Vas a la terminal y escribes: </w:t>
+        <w:rPr>
+          <w:b/>
+        </w:rPr>
+        <w:t>Si te llama el dueño de Moul para un cambio:</w:t>
+      </w:r>
+      <w:r>
+        <w:rPr/>
+        <w:t xml:space="preserve"> Vas a la terminal y escribes: </w:t>
       </w:r>
       <w:r>
         <w:rPr>
@@ -534,25 +579,16 @@
       </w:r>
       <w:r>
         <w:rPr/>
-        <w:t xml:space="preserve"> </w:t>
-      </w:r>
-      <w:r>
-        <w:rPr>
-          <w:i/>
-        </w:rPr>
-        <w:t xml:space="preserve">(El código de tu carpeta cambia solo. Haces el cambio, guardas con </w:t>
-      </w:r>
-      <w:r>
-        <w:rPr>
-          <w:rStyle w:val="Textooriginal"/>
-          <w:i/>
+        <w:t xml:space="preserve"> (El código de tu carpeta cambia solo. Haces el cambio, guardas con </w:t>
+      </w:r>
+      <w:r>
+        <w:rPr>
+          <w:rStyle w:val="Textooriginal"/>
         </w:rPr>
         <w:t>git push</w:t>
       </w:r>
       <w:r>
-        <w:rPr>
-          <w:i/>
-        </w:rPr>
+        <w:rPr/>
         <w:t xml:space="preserve"> y se actualiza solo el Vercel de Moul).</w:t>
       </w:r>
     </w:p>
@@ -571,18 +607,14 @@
         <w:rPr/>
       </w:pPr>
       <w:r>
-        <w:rPr/>
-        <w:t xml:space="preserve">Si te llama el dueño de </w:t>
-      </w:r>
-      <w:r>
-        <w:rPr>
-          <w:b/>
-        </w:rPr>
-        <w:t>Roma</w:t>
-      </w:r>
-      <w:r>
-        <w:rPr/>
-        <w:t xml:space="preserve"> para un cambio: Vas a la terminal y escribes: </w:t>
+        <w:rPr>
+          <w:b/>
+        </w:rPr>
+        <w:t>Si te llama el dueño de Roma para un cambio:</w:t>
+      </w:r>
+      <w:r>
+        <w:rPr/>
+        <w:t xml:space="preserve"> Vas a la terminal y escribes: </w:t>
       </w:r>
       <w:r>
         <w:rPr>
@@ -592,13 +624,42 @@
       </w:r>
       <w:r>
         <w:rPr/>
-        <w:t xml:space="preserve"> </w:t>
-      </w:r>
-      <w:r>
-        <w:rPr>
-          <w:i/>
-        </w:rPr>
-        <w:t>(El código vuelve a cambiar al de Roma. Guardas y se actualiza solo el Vercel de Roma).</w:t>
+        <w:t xml:space="preserve"> (El código vuelve a cambiar al de Roma. Guardas y se actualiza solo el Vercel de Roma).</w:t>
+      </w:r>
+    </w:p>
+    <w:p>
+      <w:pPr>
+        <w:pStyle w:val="BodyText"/>
+        <w:numPr>
+          <w:ilvl w:val="0"/>
+          <w:numId w:val="2"/>
+        </w:numPr>
+        <w:tabs>
+          <w:tab w:val="clear" w:pos="709"/>
+          <w:tab w:val="left" w:pos="0" w:leader="none"/>
+        </w:tabs>
+        <w:ind w:hanging="283" w:start="709"/>
+        <w:rPr/>
+      </w:pPr>
+      <w:r>
+        <w:rPr>
+          <w:b/>
+        </w:rPr>
+        <w:t>Si quieres mejorar algo para todos los futuros clientes:</w:t>
+      </w:r>
+      <w:r>
+        <w:rPr/>
+        <w:t xml:space="preserve"> Vas a la terminal y escribes: </w:t>
+      </w:r>
+      <w:r>
+        <w:rPr>
+          <w:rStyle w:val="Textooriginal"/>
+        </w:rPr>
+        <w:t>git checkout main</w:t>
+      </w:r>
+      <w:r>
+        <w:rPr/>
+        <w:t>. Haces la mejora, la guardas, y esa será la base para tu próximo cliente.</w:t>
       </w:r>
     </w:p>
     <w:p>
@@ -942,7 +1003,6 @@
     </w:lvl>
     <w:lvl w:ilvl="3">
       <w:start w:val="1"/>
-      <w:pStyle w:val="Heading4"/>
       <w:numFmt w:val="none"/>
       <w:suff w:val="nothing"/>
       <w:lvlText w:val=""/>

</xml_diff>